<commit_message>
docs: add Chapter 3 All-Code Team Review Checklist to ke_hoach_phan_chia_cong_viec_sap_toi.docx
</commit_message>
<xml_diff>
--- a/ke_hoach_phan_chia_cong_viec_sap_toi.docx
+++ b/ke_hoach_phan_chia_cong_viec_sap_toi.docx
@@ -31,7 +31,7 @@
           <w:sz w:val="22"/>
           <w:szCs w:val="22"/>
         </w:rPr>
-        <w:t xml:space="preserve">Dự án HảiSản.vn (sea_shop) — Phân Công 4 Thành Viên: Review Test, UI/UX Bug Fixing, Slide Design &amp; Code Feature Quảng Cáo Doanh Thu</w:t>
+        <w:t xml:space="preserve">Dự án HảiSản.vn (sea_shop) — Phân Công 4 Thành Viên: Review Test, UI/UX Bug Fixing, Slide Design, Code Feature Quảng Cáo &amp; Quy Trình Tổng Review Mã Nguồn Toàn Dự Án</w:t>
       </w:r>
     </w:p>
     <w:p>
@@ -120,7 +120,18 @@
         <w:t xml:space="preserve">4. Nâng tầm sản phẩm thương mại (Monetization Feature Code): </w:t>
       </w:r>
       <w:r>
-        <w:t xml:space="preserve">Một người thực thi ý tưởng và code trực tiếp tính năng Quảng cáo Nước chấm &amp; Ngư cụ để chứng minh khả năng tạo doanh thu của ứng dụng.</w:t>
+        <w:t xml:space="preserve">Một người thực thi ý tưởng và code trực tiếp tính năng Quảng cáo Nước chấm &amp; Ngư cụ để chứng minh khả năng tạo doanh thu của ứng dụng.
+</w:t>
+      </w:r>
+      <w:r>
+        <w:rPr>
+          <w:b/>
+          <w:bCs/>
+        </w:rPr>
+        <w:t xml:space="preserve">5. Tổng Review Toàn Bộ Mã Nguồn Dự Án (All-Code Team Review): </w:t>
+      </w:r>
+      <w:r>
+        <w:t xml:space="preserve">Cả 4 thành viên cùng ngồi lại đọc và rà soát từng module code để nắm vững 100% logic hệ thống, tự tin trả lời bất kỳ câu hỏi phản biện nào từ Hội đồng.</w:t>
       </w:r>
     </w:p>
     <w:p>
@@ -1077,7 +1088,7 @@
           <w:sz w:val="24"/>
           <w:szCs w:val="24"/>
         </w:rPr>
-        <w:t xml:space="preserve">CHƯƠNG 3. TIÊU CHÍ NGHIỆM THU CÔNG VIỆC (DEFINITION OF DONE - DOD)</w:t>
+        <w:t xml:space="preserve">CHƯƠNG 3. QUY TRÌNH TỔNG RÀ SOÁT MÃ NGUỒN TOÀN DỰ ÁN CỦA CẢ NHÓM (ALL-CODE TEAM REVIEW)</w:t>
       </w:r>
     </w:p>
     <w:p>
@@ -1089,7 +1100,24 @@
           <w:sz w:val="20"/>
           <w:szCs w:val="20"/>
         </w:rPr>
-        <w:t xml:space="preserve">Để đảm bảo cả 4 nhánh công việc hoàn thành đồng bộ trước buổi bảo vệ, nhóm áp dụng các tiêu chuẩn nghiệm thu sau:
+        <w:t xml:space="preserve">Song song với nhiệm vụ riêng, cả 4 thành viên sẽ dành 01 buổi họp chung để </w:t>
+      </w:r>
+      <w:r>
+        <w:rPr>
+          <w:b/>
+          <w:bCs/>
+          <w:color w:val="0D9488"/>
+          <w:sz w:val="20"/>
+          <w:szCs w:val="20"/>
+        </w:rPr>
+        <w:t xml:space="preserve">Review 100% Mã Nguồn (All-Code Audit) </w:t>
+      </w:r>
+      <w:r>
+        <w:rPr>
+          <w:sz w:val="20"/>
+          <w:szCs w:val="20"/>
+        </w:rPr>
+        <w:t xml:space="preserve">nhằm đảm bảo không sót bất kỳ lỗi ẩn nào và giúp ai cũng có thể giải trình code khi bị Thầy Cô hỏi bất ngờ:
 </w:t>
       </w:r>
       <w:r>
@@ -1097,10 +1125,10 @@
           <w:b/>
           <w:bCs/>
         </w:rPr>
-        <w:t xml:space="preserve">1. Tiêu chuẩn Test: </w:t>
-      </w:r>
-      <w:r>
-        <w:t xml:space="preserve">Lệnh `npm run test:all` chạy thành công 100% không báo bất kỳ lỗi đỏ nào.
+        <w:t xml:space="preserve">1. Đòn rà sạch code thừa (Dead Code &amp; Console Cleanup): </w:t>
+      </w:r>
+      <w:r>
+        <w:t xml:space="preserve">Quét và loại bỏ toàn bộ các câu lệnh `console.log` thử nghiệm, comment code rác, và biến không sử dụng (unused variables). Thay thế bằng logger chuẩn hóa.
 </w:t>
       </w:r>
       <w:r>
@@ -1108,10 +1136,10 @@
           <w:b/>
           <w:bCs/>
         </w:rPr>
-        <w:t xml:space="preserve">2. Tiêu chuẩn UI/UX: </w:t>
-      </w:r>
-      <w:r>
-        <w:t xml:space="preserve">Ứng dụng hiển thị chỉn chu trên cả màn hình Desktop (1920x1080) và Mobile (375x812).
+        <w:t xml:space="preserve">2. Kiểm tra tuân thủ ranh giới Clean Architecture: </w:t>
+      </w:r>
+      <w:r>
+        <w:t xml:space="preserve">Đảm bảo các file trong `src/modules/*/domain/` tuyệt đối KHÔNG import Mongoose, Express hay thư viện ngoài. Tầng Domain phải là thuần TypeScript.
 </w:t>
       </w:r>
       <w:r>
@@ -1119,10 +1147,10 @@
           <w:b/>
           <w:bCs/>
         </w:rPr>
-        <w:t xml:space="preserve">3. Tiêu chuẩn Slide: </w:t>
-      </w:r>
-      <w:r>
-        <w:t xml:space="preserve">Slide thiết kế chuyên nghiệp, chữ to rõ ràng, có sẵn kịch bản lời thoại thuyết minh cho từng trang.
+        <w:t xml:space="preserve">3. Rà soát bảo mật &amp; Chuẩn hóa kiểu dữ liệu (Security &amp; Strict Typing): </w:t>
+      </w:r>
+      <w:r>
+        <w:t xml:space="preserve">Loại bỏ kiểu dữ liệu `any` không cần thiết, kiểm tra lại toàn bộ các hàm validate `express-validator` và phân quyền `sellerOnly`/`adminOnly` ở tất cả các routes.
 </w:t>
       </w:r>
       <w:r>
@@ -1130,10 +1158,10 @@
           <w:b/>
           <w:bCs/>
         </w:rPr>
-        <w:t xml:space="preserve">4. Tiêu chuẩn Tính năng Quảng cáo: </w:t>
-      </w:r>
-      <w:r>
-        <w:t xml:space="preserve">Banner quảng cáo hiển thị đúng ngữ cảnh (nước chấm cho người mua, ngư cụ cho ngư dân) và bấm chuyển liên kết mượt mà.</w:t>
+        <w:t xml:space="preserve">4. Truyền thông tri thức chéo (Cross-Member Code Knowledge Sharing): </w:t>
+      </w:r>
+      <w:r>
+        <w:t xml:space="preserve">Từng bạn giải thích ngắn 5 phút về module mình viết cho 3 bạn còn lại nghe. Đảm bảo khi Thầy Cô chỉ định ngẫu nhiên một bạn giải thích hàm `deleteAccount` hay `GPSCoordinates`, ai cũng có thể trả lời trôi chảy.</w:t>
       </w:r>
     </w:p>
     <w:p>
@@ -1149,7 +1177,7 @@
           <w:sz w:val="24"/>
           <w:szCs w:val="24"/>
         </w:rPr>
-        <w:t xml:space="preserve">CHƯƠNG 4. KỊCH BẢN PHỐI HỢP &amp; LỊCH TỔNG RỦ CỦA NHÓM (REHEARSAL SCHEDULE)</w:t>
+        <w:t xml:space="preserve">CHƯƠNG 4. TIÊU CHÍ NGHIỆM THU CÔNG VIỆC (DEFINITION OF DONE - DOD)</w:t>
       </w:r>
     </w:p>
     <w:p>
@@ -1161,6 +1189,66 @@
           <w:sz w:val="20"/>
           <w:szCs w:val="20"/>
         </w:rPr>
+        <w:t xml:space="preserve">1. Tiêu chuẩn Test: Lệnh `npm run test:all` chạy thành công 100% không báo bất kỳ lỗi đỏ nào.
+</w:t>
+      </w:r>
+      <w:r>
+        <w:rPr>
+          <w:sz w:val="20"/>
+          <w:szCs w:val="20"/>
+        </w:rPr>
+        <w:t xml:space="preserve">2. Tiêu chuẩn UI/UX: Ứng dụng hiển thị chỉn chu trên cả màn hình Desktop (1920x1080) và Mobile (375x812).
+</w:t>
+      </w:r>
+      <w:r>
+        <w:rPr>
+          <w:sz w:val="20"/>
+          <w:szCs w:val="20"/>
+        </w:rPr>
+        <w:t xml:space="preserve">3. Tiêu chuẩn Slide: Slide thiết kế chuyên nghiệp, chữ to rõ ràng, có sẵn kịch bản lời thoại thuyết minh cho từng trang.
+</w:t>
+      </w:r>
+      <w:r>
+        <w:rPr>
+          <w:sz w:val="20"/>
+          <w:szCs w:val="20"/>
+        </w:rPr>
+        <w:t xml:space="preserve">4. Tiêu chuẩn Tính năng Quảng cáo: Banner quảng cáo hiển thị đúng ngữ cảnh (nước chấm cho người mua, ngư cụ cho ngư dân) và bấm chuyển liên kết mượt mà.
+</w:t>
+      </w:r>
+      <w:r>
+        <w:rPr>
+          <w:sz w:val="20"/>
+          <w:szCs w:val="20"/>
+        </w:rPr>
+        <w:t xml:space="preserve">5. Tiêu chuẩn Code Review: Mã nguồn không còn console.log thừa, biên dịch `tsc` 0 lỗi và 100% thành viên nắm vững toàn bộ codebase.</w:t>
+      </w:r>
+    </w:p>
+    <w:p>
+      <w:pPr>
+        <w:pStyle w:val="Heading1"/>
+        <w:spacing w:after="180" w:before="240"/>
+      </w:pPr>
+      <w:r>
+        <w:rPr>
+          <w:b/>
+          <w:bCs/>
+          <w:color w:val="0F172A"/>
+          <w:sz w:val="24"/>
+          <w:szCs w:val="24"/>
+        </w:rPr>
+        <w:t xml:space="preserve">CHƯƠNG 5. KỊCH BẢN PHỐI HỢP &amp; LỊCH TỔNG RỦ CỦA NHÓM (REHEARSAL SCHEDULE)</w:t>
+      </w:r>
+    </w:p>
+    <w:p>
+      <w:pPr>
+        <w:spacing w:after="240"/>
+      </w:pPr>
+      <w:r>
+        <w:rPr>
+          <w:sz w:val="20"/>
+          <w:szCs w:val="20"/>
+        </w:rPr>
         <w:t xml:space="preserve">• Ngày 1: Các thành viên bắt tay thực hiện nhiệm vụ cá nhân (Code feature quảng cáo, rà soát test, tìm bug UI, thiết kế slide).
 </w:t>
       </w:r>
@@ -1169,7 +1257,7 @@
           <w:sz w:val="20"/>
           <w:szCs w:val="20"/>
         </w:rPr>
-        <w:t xml:space="preserve">• Ngày 2: Hợp nhóm trực tuyến review chéo kết quả (Merge code tính năng quảng cáo, chạy lại test suite, xem bản nháp slide).
+        <w:t xml:space="preserve">• Ngày 2: Họp nhóm All-Code Review (Cả nhóm ngồi lại rà soát 100% mã nguồn, clean code thừa, merge feature quảng cáo và chạy lại test suite).
 </w:t>
       </w:r>
       <w:r>

</xml_diff>